<commit_message>
feat(motor): microsuenos con periodo de plenitud y gates de crisis/pareja en decision
</commit_message>
<xml_diff>
--- a/informes/informe_funcionalidades_actuales.docx
+++ b/informes/informe_funcionalidades_actuales.docx
@@ -2818,6 +2818,116 @@
       </w:pPr>
       <w:r>
         <w:t xml:space="preserve">Diego pidió mover el trabajo de sesiones de Cowork a una memoria versionada en el repositorio (CLAUDE.md) y poner al día los informes existentes antes de dejar de usar Cowork. Esta revisión aplica ocho correcciones puntuales dentro de las secciones ya existentes (marcadas en línea con RESUELTO, CORREGIDO, SUPERADO o NUEVO y la fecha) en vez de reescribir el documento entero: la mayoría de lo descrito aquí seguía siendo cierto — el trabajo de las áreas 1, 2, 4, 5, 7, 9, 12, 13 y 16 no cambió desde la versión anterior de este informe. Las áreas realmente afectadas fueron 3 (num_manchas dinámico), 6 (purga de memoria), 8 (orden gregario/territorio — contradecía al código real, no una simple omisión), 10 (viabilidad energética, detectabilidad, y el giro de extinción a sobrepoblación), 11 (recalibración de vejez), 14 (persistencia de recurso, ya resuelta) y 15 (rendering real de la vista web, más el experimento de arte con sprites propios que se integró, se verificó y se revirtió el mismo día). No se ha tocado la metodología original del informe ni sus tres categorías de clasificación.</w:t>
+      </w:r>
+    </w:p>
+    <w:p>
+      <w:pPr>
+        <w:pStyle w:val="Heading1"/>
+      </w:pPr>
+      <w:r>
+        <w:t>Adenda (28-08): capa de presentación con sellos cartográficos, agua pintada y poses por estado del ECS</w:t>
+      </w:r>
+    </w:p>
+    <w:p>
+      <w:r>
+        <w:t>Esta adenda pone al día las secciones afectadas por las sesiones del 27-08 y 28-08. La fuente detallada, con la cronología completa de intentos y las lecciones de verificación, es la bitácora de implementación (informe_implementacion_bosque.docx, secciones 7.70 a 7.75); aquí solo se asienta el estado funcional vigente y su clasificación.</w:t>
+      </w:r>
+    </w:p>
+    <w:p>
+      <w:r>
+        <w:t>Sección 15 (Presentación). Implementado completo:</w:t>
+      </w:r>
+    </w:p>
+    <w:p>
+      <w:pPr>
+        <w:pStyle w:val="ListParagraph"/>
+      </w:pPr>
+      <w:r>
+        <w:t>Vista web -- poses de criaturas por estado del ECS (NUEVO, 27-08): biblioteca presentacion/assets/criaturas_poses/ con kit por especie (idle por dirección, andar, forrajeando, durmiendo, herido, muerto). resolverPose() resuelve herida por vitalidad, durmiendo/forrajeando por acción y andar/idle por dirección de marcha con la última dirección persistida; necromasa usa la pose muerta de su especie de origen. Cadena de fallback hasta el sprite genérico y, sin asset, halo+runa. Verificado con arnés mock-DOM (21 comprobaciones).</w:t>
+      </w:r>
+    </w:p>
+    <w:p>
+      <w:pPr>
+        <w:pStyle w:val="ListParagraph"/>
+      </w:pPr>
+      <w:r>
+        <w:t>Vista web -- tres modos de mapa con botones (NUEVO, 27-08): Codice (lavado continuo de biomas), Relieve (hipsométrico) e Hidro (tierra pergamino, agua por profundidad). Estado en modoMapa con setModoMapa; el marco de códice a zoom macro se dibuja en espacio de pantalla (tamaño de trazo constante).</w:t>
+      </w:r>
+    </w:p>
+    <w:p>
+      <w:pPr>
+        <w:pStyle w:val="ListParagraph"/>
+      </w:pPr>
+      <w:r>
+        <w:t>Vista web -- montaña por rangos de zoom (NUEVO, 28-08): a macro, formaciones de imagen por masa (cordillera_1..4.png para montaña, más masa_bosque, masa_desierto y masa_tundra); a medio-tinta, solo la formación de montaña; a color, sellos por celda sepia (montana_color). El relieve vectorial triangular queda solo como fallback sin biblioteca. Con la lección de fondo: los PNG montana_15-26 son panorámicas (no montañas unitarias) y el estampado por celda en tinta las fundía en masas oscuras.</w:t>
+      </w:r>
+    </w:p>
+    <w:p>
+      <w:pPr>
+        <w:pStyle w:val="ListParagraph"/>
+      </w:pPr>
+      <w:r>
+        <w:t>Vista web -- agua pintada con hachurado horizontal (CAMBIADO, 28-08): retirados los sellos de imagen del agua y las bandas concéntricas de profundidad. pintarCuerpoAgua() dibuja silueta suavizada (chaikin sin ondular), relleno base y trazos ondulados paralelos recortados por la silueta (clip). En tinta: lavado gris y trazos de tinta; en color: relleno orilla y trazos azul profundo. Lagos, pozas y el río (dibujarRioVectorial delega) comparten el mismo pintado.</w:t>
+      </w:r>
+    </w:p>
+    <w:p>
+      <w:pPr>
+        <w:pStyle w:val="ListParagraph"/>
+      </w:pPr>
+      <w:r>
+        <w:t>Vista web -- LOD tinta/color (CAMBIADO, 27-08): ZOOM_ESTILO_COLOR baja de 1.6 a 1.0; a partir de 1.0 el mapa usa la variante sepia de la biblioteca y por debajo el modo tinta de códice.</w:t>
+      </w:r>
+    </w:p>
+    <w:p>
+      <w:pPr>
+        <w:pStyle w:val="ListParagraph"/>
+      </w:pPr>
+      <w:r>
+        <w:t>Biblioteca de sellos curada (CAMBIADO, 27-08): relieve/ queda con cordillera_1..4 (formaciones), montana_15-26 (panorámicas sin uso por celda en tinta), masa_desierto_1..4 y masa_tundra_1..3; el resto movido a relieve/descartados/ (no borrado). relieve_color/ con 7 sepias. flora_color/ ampliada con estados de planta (liquen, musgo, cactus_fruto, manzano_fruto/brote/seco) usados según el estado del recurso y la etapa de la planta. estamparEnRecuadro con encuadre contain y selección de sello por aspecto del cluster.</w:t>
+      </w:r>
+    </w:p>
+    <w:p>
+      <w:r>
+        <w:t>Sección 16 (Infraestructura). Implementado completo:</w:t>
+      </w:r>
+    </w:p>
+    <w:p>
+      <w:pPr>
+        <w:pStyle w:val="ListParagraph"/>
+      </w:pPr>
+      <w:r>
+        <w:t>Arnés de ejecución completa del visor (NUEVO, 28-08, desechable pero replicable): el &lt;script&gt; del visor corre en node (vm con stubs de DOM/canvas/Image/fetch) contra los datos reales del motor vivo (/estado.json y /assets_manifest.json). Permite capturar excepciones de dibujarFrame con stack, registrar todas las llamadas de dibujo por nivel de zoom y ejecutar funciones del visor de forma aislada. Fue la herramienta que localizó tanto la regresión del borrado de 19 funciones como el bug de la formación de montaña (ver bitácora 7.71-7.74).</w:t>
+      </w:r>
+    </w:p>
+    <w:p>
+      <w:r>
+        <w:t>Sección 3 (Flora). Implementado completo:</w:t>
+      </w:r>
+    </w:p>
+    <w:p>
+      <w:pPr>
+        <w:pStyle w:val="ListParagraph"/>
+      </w:pPr>
+      <w:r>
+        <w:t>Guards de agua permanente (NUEVO, 27-08): la siembra inicial (sembrar_flora_inicial) y la propagación (_intentar_propagacion) rechazan celdas con tiene_agua, cerrando el hueco por el que nacían plantas sobre lagos y ríos.</w:t>
+      </w:r>
+    </w:p>
+    <w:p>
+      <w:r>
+        <w:t>Motor de ríos (afecta a las secciones 1 y 15). Implementado parcial:</w:t>
+      </w:r>
+    </w:p>
+    <w:p>
+      <w:pPr>
+        <w:pStyle w:val="ListParagraph"/>
+      </w:pPr>
+      <w:r>
+        <w:t>Inercia del cauce (NUEVO, 27-08, PROVISIONAL): _trazar_rio penaliza el giro según agua.coste_giro_rio = 0.004 (calibrado a ojo contra un trazado de referencia: 11 giros -&gt; 4). Falta validación contra el arnés completo de 15 semillas x 12000 ticks.</w:t>
+      </w:r>
+    </w:p>
+    <w:p>
+      <w:r>
+        <w:t>Estado del repositorio: el trabajo de las sesiones 27-08 y 28-08 no está comiteado (último commit dfbc774). La limitación conocida de sobrepoblación sin techo (7.52) sigue abierta.</w:t>
       </w:r>
     </w:p>
     <w:sectPr>

</xml_diff>